<commit_message>
Keys: centre answers in their boxes
Lead-in spacing moved outside the run border; each boxed answer gets one
no-break-space pad per side, set in the fallback face because ShullHand has
no U+00A0 glyph (it fell through to a wider font on one side only).

Co-Authored-By: Claude Opus 5.5 <noreply@anthropic.com>
Claude-Session: https://claude.ai/code/session_01LaT1EarAMnh5opQoFahNzN
</commit_message>
<xml_diff>
--- a/output/chem-u02/Unit 2 Quiz A Key.docx
+++ b/output/chem-u02/Unit 2 Quiz A Key.docx
@@ -444,9 +444,35 @@
                 <w:rFonts w:ascii="ShullHand" w:hAnsi="ShullHand"/>
                 <w:color w:val="4A2466"/>
                 <w:sz w:val="26"/>
+              </w:rPr>
+              <w:t xml:space="preserve">   </w:t>
+            </w:r>
+            <w:r>
+              <w:rPr>
+                <w:rFonts w:ascii="Patrick Hand" w:hAnsi="Patrick Hand"/>
+                <w:color w:val="4A2466"/>
+                <w:sz w:val="26"/>
                 <w:bdr w:val="single" w:sz="8" w:space="1" w:color="9F1D2C"/>
               </w:rPr>
-              <w:t xml:space="preserve">   A</w:t>
+              <w:t xml:space="preserve"> </w:t>
+            </w:r>
+            <w:r>
+              <w:rPr>
+                <w:rFonts w:ascii="ShullHand" w:hAnsi="ShullHand"/>
+                <w:color w:val="4A2466"/>
+                <w:sz w:val="26"/>
+                <w:bdr w:val="single" w:sz="8" w:space="1" w:color="9F1D2C"/>
+              </w:rPr>
+              <w:t>A</w:t>
+            </w:r>
+            <w:r>
+              <w:rPr>
+                <w:rFonts w:ascii="Patrick Hand" w:hAnsi="Patrick Hand"/>
+                <w:color w:val="4A2466"/>
+                <w:sz w:val="26"/>
+                <w:bdr w:val="single" w:sz="8" w:space="1" w:color="9F1D2C"/>
+              </w:rPr>
+              <w:t xml:space="preserve"> </w:t>
             </w:r>
             <w:r>
               <w:rPr>
@@ -725,9 +751,35 @@
                 <w:rFonts w:ascii="ShullHand" w:hAnsi="ShullHand"/>
                 <w:color w:val="4A2466"/>
                 <w:sz w:val="26"/>
+              </w:rPr>
+              <w:t xml:space="preserve">   </w:t>
+            </w:r>
+            <w:r>
+              <w:rPr>
+                <w:rFonts w:ascii="Patrick Hand" w:hAnsi="Patrick Hand"/>
+                <w:color w:val="4A2466"/>
+                <w:sz w:val="26"/>
                 <w:bdr w:val="single" w:sz="8" w:space="1" w:color="9F1D2C"/>
               </w:rPr>
-              <w:t xml:space="preserve">   C</w:t>
+              <w:t xml:space="preserve"> </w:t>
+            </w:r>
+            <w:r>
+              <w:rPr>
+                <w:rFonts w:ascii="ShullHand" w:hAnsi="ShullHand"/>
+                <w:color w:val="4A2466"/>
+                <w:sz w:val="26"/>
+                <w:bdr w:val="single" w:sz="8" w:space="1" w:color="9F1D2C"/>
+              </w:rPr>
+              <w:t>C</w:t>
+            </w:r>
+            <w:r>
+              <w:rPr>
+                <w:rFonts w:ascii="Patrick Hand" w:hAnsi="Patrick Hand"/>
+                <w:color w:val="4A2466"/>
+                <w:sz w:val="26"/>
+                <w:bdr w:val="single" w:sz="8" w:space="1" w:color="9F1D2C"/>
+              </w:rPr>
+              <w:t xml:space="preserve"> </w:t>
             </w:r>
             <w:r>
               <w:rPr>
@@ -1429,9 +1481,35 @@
                 <w:rFonts w:ascii="ShullHand" w:hAnsi="ShullHand"/>
                 <w:color w:val="4A2466"/>
                 <w:sz w:val="26"/>
+              </w:rPr>
+              <w:t xml:space="preserve">   </w:t>
+            </w:r>
+            <w:r>
+              <w:rPr>
+                <w:rFonts w:ascii="Patrick Hand" w:hAnsi="Patrick Hand"/>
+                <w:color w:val="4A2466"/>
+                <w:sz w:val="26"/>
                 <w:bdr w:val="single" w:sz="8" w:space="1" w:color="9F1D2C"/>
               </w:rPr>
-              <w:t xml:space="preserve">   B</w:t>
+              <w:t xml:space="preserve"> </w:t>
+            </w:r>
+            <w:r>
+              <w:rPr>
+                <w:rFonts w:ascii="ShullHand" w:hAnsi="ShullHand"/>
+                <w:color w:val="4A2466"/>
+                <w:sz w:val="26"/>
+                <w:bdr w:val="single" w:sz="8" w:space="1" w:color="9F1D2C"/>
+              </w:rPr>
+              <w:t>B</w:t>
+            </w:r>
+            <w:r>
+              <w:rPr>
+                <w:rFonts w:ascii="Patrick Hand" w:hAnsi="Patrick Hand"/>
+                <w:color w:val="4A2466"/>
+                <w:sz w:val="26"/>
+                <w:bdr w:val="single" w:sz="8" w:space="1" w:color="9F1D2C"/>
+              </w:rPr>
+              <w:t xml:space="preserve"> </w:t>
             </w:r>
             <w:r>
               <w:rPr>
@@ -1888,6 +1966,15 @@
                 <w:sz w:val="24"/>
                 <w:bdr w:val="single" w:sz="8" w:space="1" w:color="9F1D2C"/>
               </w:rPr>
+              <w:t xml:space="preserve"> </w:t>
+            </w:r>
+            <w:r>
+              <w:rPr>
+                <w:rFonts w:ascii="Patrick Hand" w:hAnsi="Patrick Hand"/>
+                <w:color w:val="4A2466"/>
+                <w:sz w:val="24"/>
+                <w:bdr w:val="single" w:sz="8" w:space="1" w:color="9F1D2C"/>
+              </w:rPr>
               <w:t>1s</w:t>
             </w:r>
             <w:r>
@@ -2095,6 +2182,15 @@
                 <w:bdr w:val="single" w:sz="8" w:space="1" w:color="9F1D2C"/>
               </w:rPr>
               <w:t>4</w:t>
+            </w:r>
+            <w:r>
+              <w:rPr>
+                <w:rFonts w:ascii="Patrick Hand" w:hAnsi="Patrick Hand"/>
+                <w:color w:val="4A2466"/>
+                <w:sz w:val="24"/>
+                <w:bdr w:val="single" w:sz="8" w:space="1" w:color="9F1D2C"/>
+              </w:rPr>
+              <w:t xml:space="preserve"> </w:t>
             </w:r>
           </w:p>
         </w:tc>
@@ -3202,6 +3298,15 @@
                 <w:sz w:val="24"/>
                 <w:bdr w:val="single" w:sz="8" w:space="1" w:color="9F1D2C"/>
               </w:rPr>
+              <w:t xml:space="preserve"> </w:t>
+            </w:r>
+            <w:r>
+              <w:rPr>
+                <w:rFonts w:ascii="Patrick Hand" w:hAnsi="Patrick Hand"/>
+                <w:color w:val="4A2466"/>
+                <w:sz w:val="24"/>
+                <w:bdr w:val="single" w:sz="8" w:space="1" w:color="9F1D2C"/>
+              </w:rPr>
               <w:t>1s</w:t>
             </w:r>
             <w:r>
@@ -3325,6 +3430,15 @@
                 <w:bdr w:val="single" w:sz="8" w:space="1" w:color="9F1D2C"/>
               </w:rPr>
               <w:t>3</w:t>
+            </w:r>
+            <w:r>
+              <w:rPr>
+                <w:rFonts w:ascii="Patrick Hand" w:hAnsi="Patrick Hand"/>
+                <w:color w:val="4A2466"/>
+                <w:sz w:val="24"/>
+                <w:bdr w:val="single" w:sz="8" w:space="1" w:color="9F1D2C"/>
+              </w:rPr>
+              <w:t xml:space="preserve"> </w:t>
             </w:r>
           </w:p>
         </w:tc>
@@ -4127,6 +4241,15 @@
                 <w:sz w:val="22"/>
                 <w:bdr w:val="single" w:sz="8" w:space="1" w:color="9F1D2C"/>
               </w:rPr>
+              <w:t xml:space="preserve"> </w:t>
+            </w:r>
+            <w:r>
+              <w:rPr>
+                <w:rFonts w:ascii="Patrick Hand" w:hAnsi="Patrick Hand"/>
+                <w:color w:val="4A2466"/>
+                <w:sz w:val="22"/>
+                <w:bdr w:val="single" w:sz="8" w:space="1" w:color="9F1D2C"/>
+              </w:rPr>
               <w:t xml:space="preserve">[Ar] </w:t>
             </w:r>
             <w:r>
@@ -4175,6 +4298,15 @@
                 <w:bdr w:val="single" w:sz="8" w:space="1" w:color="9F1D2C"/>
               </w:rPr>
               <w:t>6</w:t>
+            </w:r>
+            <w:r>
+              <w:rPr>
+                <w:rFonts w:ascii="Patrick Hand" w:hAnsi="Patrick Hand"/>
+                <w:color w:val="4A2466"/>
+                <w:sz w:val="22"/>
+                <w:bdr w:val="single" w:sz="8" w:space="1" w:color="9F1D2C"/>
+              </w:rPr>
+              <w:t xml:space="preserve"> </w:t>
             </w:r>
           </w:p>
         </w:tc>
@@ -4284,6 +4416,15 @@
                 <w:sz w:val="22"/>
                 <w:bdr w:val="single" w:sz="8" w:space="1" w:color="9F1D2C"/>
               </w:rPr>
+              <w:t xml:space="preserve"> </w:t>
+            </w:r>
+            <w:r>
+              <w:rPr>
+                <w:rFonts w:ascii="Patrick Hand" w:hAnsi="Patrick Hand"/>
+                <w:color w:val="4A2466"/>
+                <w:sz w:val="22"/>
+                <w:bdr w:val="single" w:sz="8" w:space="1" w:color="9F1D2C"/>
+              </w:rPr>
               <w:t xml:space="preserve">[Kr] </w:t>
             </w:r>
             <w:r>
@@ -4360,6 +4501,15 @@
                 <w:bdr w:val="single" w:sz="8" w:space="1" w:color="9F1D2C"/>
               </w:rPr>
               <w:t>2</w:t>
+            </w:r>
+            <w:r>
+              <w:rPr>
+                <w:rFonts w:ascii="Patrick Hand" w:hAnsi="Patrick Hand"/>
+                <w:color w:val="4A2466"/>
+                <w:sz w:val="22"/>
+                <w:bdr w:val="single" w:sz="8" w:space="1" w:color="9F1D2C"/>
+              </w:rPr>
+              <w:t xml:space="preserve"> </w:t>
             </w:r>
           </w:p>
         </w:tc>
@@ -4580,6 +4730,15 @@
                 <w:sz w:val="28"/>
                 <w:bdr w:val="single" w:sz="8" w:space="1" w:color="9F1D2C"/>
               </w:rPr>
+              <w:t xml:space="preserve"> </w:t>
+            </w:r>
+            <w:r>
+              <w:rPr>
+                <w:rFonts w:ascii="Patrick Hand" w:hAnsi="Patrick Hand"/>
+                <w:color w:val="4A2466"/>
+                <w:sz w:val="28"/>
+                <w:bdr w:val="single" w:sz="8" w:space="1" w:color="9F1D2C"/>
+              </w:rPr>
               <w:t>2</w:t>
             </w:r>
             <w:r>
@@ -4590,6 +4749,15 @@
                 <w:bdr w:val="single" w:sz="8" w:space="1" w:color="9F1D2C"/>
               </w:rPr>
               <w:t>+</w:t>
+            </w:r>
+            <w:r>
+              <w:rPr>
+                <w:rFonts w:ascii="Patrick Hand" w:hAnsi="Patrick Hand"/>
+                <w:color w:val="4A2466"/>
+                <w:sz w:val="28"/>
+                <w:bdr w:val="single" w:sz="8" w:space="1" w:color="9F1D2C"/>
+              </w:rPr>
+              <w:t xml:space="preserve"> </w:t>
             </w:r>
           </w:p>
           <w:p>
@@ -4743,6 +4911,15 @@
                 <w:sz w:val="28"/>
                 <w:bdr w:val="single" w:sz="8" w:space="1" w:color="9F1D2C"/>
               </w:rPr>
+              <w:t xml:space="preserve"> </w:t>
+            </w:r>
+            <w:r>
+              <w:rPr>
+                <w:rFonts w:ascii="Patrick Hand" w:hAnsi="Patrick Hand"/>
+                <w:color w:val="4A2466"/>
+                <w:sz w:val="28"/>
+                <w:bdr w:val="single" w:sz="8" w:space="1" w:color="9F1D2C"/>
+              </w:rPr>
               <w:t>3</w:t>
             </w:r>
             <w:r>
@@ -4753,6 +4930,15 @@
                 <w:bdr w:val="single" w:sz="8" w:space="1" w:color="9F1D2C"/>
               </w:rPr>
               <w:t>−</w:t>
+            </w:r>
+            <w:r>
+              <w:rPr>
+                <w:rFonts w:ascii="Patrick Hand" w:hAnsi="Patrick Hand"/>
+                <w:color w:val="4A2466"/>
+                <w:sz w:val="28"/>
+                <w:bdr w:val="single" w:sz="8" w:space="1" w:color="9F1D2C"/>
+              </w:rPr>
+              <w:t xml:space="preserve"> </w:t>
             </w:r>
           </w:p>
           <w:p>
@@ -4906,6 +5092,15 @@
                 <w:sz w:val="28"/>
                 <w:bdr w:val="single" w:sz="8" w:space="1" w:color="9F1D2C"/>
               </w:rPr>
+              <w:t xml:space="preserve"> </w:t>
+            </w:r>
+            <w:r>
+              <w:rPr>
+                <w:rFonts w:ascii="Patrick Hand" w:hAnsi="Patrick Hand"/>
+                <w:color w:val="4A2466"/>
+                <w:sz w:val="28"/>
+                <w:bdr w:val="single" w:sz="8" w:space="1" w:color="9F1D2C"/>
+              </w:rPr>
               <w:t>3</w:t>
             </w:r>
             <w:r>
@@ -4916,6 +5111,15 @@
                 <w:bdr w:val="single" w:sz="8" w:space="1" w:color="9F1D2C"/>
               </w:rPr>
               <w:t>+</w:t>
+            </w:r>
+            <w:r>
+              <w:rPr>
+                <w:rFonts w:ascii="Patrick Hand" w:hAnsi="Patrick Hand"/>
+                <w:color w:val="4A2466"/>
+                <w:sz w:val="28"/>
+                <w:bdr w:val="single" w:sz="8" w:space="1" w:color="9F1D2C"/>
+              </w:rPr>
+              <w:t xml:space="preserve"> </w:t>
             </w:r>
           </w:p>
           <w:p>
@@ -5069,6 +5273,15 @@
                 <w:sz w:val="28"/>
                 <w:bdr w:val="single" w:sz="8" w:space="1" w:color="9F1D2C"/>
               </w:rPr>
+              <w:t xml:space="preserve"> </w:t>
+            </w:r>
+            <w:r>
+              <w:rPr>
+                <w:rFonts w:ascii="Patrick Hand" w:hAnsi="Patrick Hand"/>
+                <w:color w:val="4A2466"/>
+                <w:sz w:val="28"/>
+                <w:bdr w:val="single" w:sz="8" w:space="1" w:color="9F1D2C"/>
+              </w:rPr>
               <w:t>1</w:t>
             </w:r>
             <w:r>
@@ -5079,6 +5292,15 @@
                 <w:bdr w:val="single" w:sz="8" w:space="1" w:color="9F1D2C"/>
               </w:rPr>
               <w:t>−</w:t>
+            </w:r>
+            <w:r>
+              <w:rPr>
+                <w:rFonts w:ascii="Patrick Hand" w:hAnsi="Patrick Hand"/>
+                <w:color w:val="4A2466"/>
+                <w:sz w:val="28"/>
+                <w:bdr w:val="single" w:sz="8" w:space="1" w:color="9F1D2C"/>
+              </w:rPr>
+              <w:t xml:space="preserve"> </w:t>
             </w:r>
           </w:p>
           <w:p>

</xml_diff>

<commit_message>
Quiz keys A-C fit on one page: no forced break, smaller key handwriting, exact Part 2 row heights
Co-Authored-By: Claude Opus 5.5 <noreply@anthropic.com>
Claude-Session: https://claude.ai/code/session_01LaT1EarAMnh5opQoFahNzN
</commit_message>
<xml_diff>
--- a/output/chem-u02/Unit 2 Quiz A Key.docx
+++ b/output/chem-u02/Unit 2 Quiz A Key.docx
@@ -443,7 +443,7 @@
               <w:rPr>
                 <w:rFonts w:ascii="ShullHand" w:hAnsi="ShullHand"/>
                 <w:color w:val="4A2466"/>
-                <w:sz w:val="26"/>
+                <w:sz w:val="22"/>
               </w:rPr>
               <w:t xml:space="preserve">   </w:t>
             </w:r>
@@ -451,7 +451,7 @@
               <w:rPr>
                 <w:rFonts w:ascii="Patrick Hand" w:hAnsi="Patrick Hand"/>
                 <w:color w:val="4A2466"/>
-                <w:sz w:val="26"/>
+                <w:sz w:val="22"/>
                 <w:bdr w:val="single" w:sz="8" w:space="1" w:color="9F1D2C"/>
               </w:rPr>
               <w:t xml:space="preserve"> </w:t>
@@ -460,7 +460,7 @@
               <w:rPr>
                 <w:rFonts w:ascii="ShullHand" w:hAnsi="ShullHand"/>
                 <w:color w:val="4A2466"/>
-                <w:sz w:val="26"/>
+                <w:sz w:val="22"/>
                 <w:bdr w:val="single" w:sz="8" w:space="1" w:color="9F1D2C"/>
               </w:rPr>
               <w:t>A</w:t>
@@ -469,7 +469,7 @@
               <w:rPr>
                 <w:rFonts w:ascii="Patrick Hand" w:hAnsi="Patrick Hand"/>
                 <w:color w:val="4A2466"/>
-                <w:sz w:val="26"/>
+                <w:sz w:val="22"/>
                 <w:bdr w:val="single" w:sz="8" w:space="1" w:color="9F1D2C"/>
               </w:rPr>
               <w:t xml:space="preserve"> </w:t>
@@ -478,7 +478,7 @@
               <w:rPr>
                 <w:rFonts w:ascii="ShullHand" w:hAnsi="ShullHand"/>
                 <w:color w:val="16609A"/>
-                <w:sz w:val="20"/>
+                <w:sz w:val="18"/>
               </w:rPr>
               <w:t xml:space="preserve">  Aufbau, lowest energy first</w:t>
             </w:r>
@@ -750,7 +750,7 @@
               <w:rPr>
                 <w:rFonts w:ascii="ShullHand" w:hAnsi="ShullHand"/>
                 <w:color w:val="4A2466"/>
-                <w:sz w:val="26"/>
+                <w:sz w:val="22"/>
               </w:rPr>
               <w:t xml:space="preserve">   </w:t>
             </w:r>
@@ -758,7 +758,7 @@
               <w:rPr>
                 <w:rFonts w:ascii="Patrick Hand" w:hAnsi="Patrick Hand"/>
                 <w:color w:val="4A2466"/>
-                <w:sz w:val="26"/>
+                <w:sz w:val="22"/>
                 <w:bdr w:val="single" w:sz="8" w:space="1" w:color="9F1D2C"/>
               </w:rPr>
               <w:t xml:space="preserve"> </w:t>
@@ -767,7 +767,7 @@
               <w:rPr>
                 <w:rFonts w:ascii="ShullHand" w:hAnsi="ShullHand"/>
                 <w:color w:val="4A2466"/>
-                <w:sz w:val="26"/>
+                <w:sz w:val="22"/>
                 <w:bdr w:val="single" w:sz="8" w:space="1" w:color="9F1D2C"/>
               </w:rPr>
               <w:t>C</w:t>
@@ -776,7 +776,7 @@
               <w:rPr>
                 <w:rFonts w:ascii="Patrick Hand" w:hAnsi="Patrick Hand"/>
                 <w:color w:val="4A2466"/>
-                <w:sz w:val="26"/>
+                <w:sz w:val="22"/>
                 <w:bdr w:val="single" w:sz="8" w:space="1" w:color="9F1D2C"/>
               </w:rPr>
               <w:t xml:space="preserve"> </w:t>
@@ -785,7 +785,7 @@
               <w:rPr>
                 <w:rFonts w:ascii="ShullHand" w:hAnsi="ShullHand"/>
                 <w:color w:val="16609A"/>
-                <w:sz w:val="20"/>
+                <w:sz w:val="18"/>
               </w:rPr>
               <w:t xml:space="preserve">  one in each box, same direction</w:t>
             </w:r>
@@ -1480,7 +1480,7 @@
               <w:rPr>
                 <w:rFonts w:ascii="ShullHand" w:hAnsi="ShullHand"/>
                 <w:color w:val="4A2466"/>
-                <w:sz w:val="26"/>
+                <w:sz w:val="22"/>
               </w:rPr>
               <w:t xml:space="preserve">   </w:t>
             </w:r>
@@ -1488,7 +1488,7 @@
               <w:rPr>
                 <w:rFonts w:ascii="Patrick Hand" w:hAnsi="Patrick Hand"/>
                 <w:color w:val="4A2466"/>
-                <w:sz w:val="26"/>
+                <w:sz w:val="22"/>
                 <w:bdr w:val="single" w:sz="8" w:space="1" w:color="9F1D2C"/>
               </w:rPr>
               <w:t xml:space="preserve"> </w:t>
@@ -1497,7 +1497,7 @@
               <w:rPr>
                 <w:rFonts w:ascii="ShullHand" w:hAnsi="ShullHand"/>
                 <w:color w:val="4A2466"/>
-                <w:sz w:val="26"/>
+                <w:sz w:val="22"/>
                 <w:bdr w:val="single" w:sz="8" w:space="1" w:color="9F1D2C"/>
               </w:rPr>
               <w:t>B</w:t>
@@ -1506,7 +1506,7 @@
               <w:rPr>
                 <w:rFonts w:ascii="Patrick Hand" w:hAnsi="Patrick Hand"/>
                 <w:color w:val="4A2466"/>
-                <w:sz w:val="26"/>
+                <w:sz w:val="22"/>
                 <w:bdr w:val="single" w:sz="8" w:space="1" w:color="9F1D2C"/>
               </w:rPr>
               <w:t xml:space="preserve"> </w:t>
@@ -1515,7 +1515,7 @@
               <w:rPr>
                 <w:rFonts w:ascii="ShullHand" w:hAnsi="ShullHand"/>
                 <w:color w:val="16609A"/>
-                <w:sz w:val="20"/>
+                <w:sz w:val="18"/>
               </w:rPr>
               <w:t xml:space="preserve">  </w:t>
             </w:r>
@@ -1523,7 +1523,7 @@
               <w:rPr>
                 <w:rFonts w:ascii="Patrick Hand" w:hAnsi="Patrick Hand"/>
                 <w:color w:val="16609A"/>
-                <w:sz w:val="20"/>
+                <w:sz w:val="18"/>
               </w:rPr>
               <w:t>4</w:t>
             </w:r>
@@ -1531,7 +1531,7 @@
               <w:rPr>
                 <w:rFonts w:ascii="ShullHand" w:hAnsi="ShullHand"/>
                 <w:color w:val="16609A"/>
-                <w:sz w:val="20"/>
+                <w:sz w:val="18"/>
               </w:rPr>
               <w:t xml:space="preserve">s, then </w:t>
             </w:r>
@@ -1539,7 +1539,7 @@
               <w:rPr>
                 <w:rFonts w:ascii="Patrick Hand" w:hAnsi="Patrick Hand"/>
                 <w:color w:val="16609A"/>
-                <w:sz w:val="20"/>
+                <w:sz w:val="18"/>
               </w:rPr>
               <w:t>3</w:t>
             </w:r>
@@ -1547,7 +1547,7 @@
               <w:rPr>
                 <w:rFonts w:ascii="ShullHand" w:hAnsi="ShullHand"/>
                 <w:color w:val="16609A"/>
-                <w:sz w:val="20"/>
+                <w:sz w:val="18"/>
               </w:rPr>
               <w:t>d</w:t>
             </w:r>
@@ -1834,7 +1834,7 @@
       <w:tr>
         <w:trPr>
           <w:cantSplit/>
-          <w:trHeight w:val="576" w:hRule="atLeast"/>
+          <w:trHeight w:val="547" w:hRule="exact"/>
         </w:trPr>
         <w:tc>
           <w:tcPr>
@@ -1869,7 +1869,7 @@
           <w:tcPr>
             <w:tcW w:type="dxa" w:w="1656"/>
             <w:vMerge w:val="restart"/>
-            <w:vAlign w:val="top"/>
+            <w:vAlign w:val="center"/>
             <w:tcMar>
               <w:top w:w="0" w:type="dxa"/>
               <w:left w:w="0" w:type="dxa"/>
@@ -1885,7 +1885,7 @@
             <w:r>
               <w:drawing>
                 <wp:inline xmlns:a="http://schemas.openxmlformats.org/drawingml/2006/main" xmlns:pic="http://schemas.openxmlformats.org/drawingml/2006/picture">
-                  <wp:extent cx="914400" cy="914400"/>
+                  <wp:extent cx="877824" cy="877824"/>
                   <wp:docPr id="1" name="Picture 1"/>
                   <wp:cNvGraphicFramePr>
                     <a:graphicFrameLocks noChangeAspect="1"/>
@@ -1906,7 +1906,7 @@
                         <pic:spPr>
                           <a:xfrm>
                             <a:off x="0" y="0"/>
-                            <a:ext cx="914400" cy="914400"/>
+                            <a:ext cx="877824" cy="877824"/>
                           </a:xfrm>
                           <a:prstGeom prst="rect"/>
                         </pic:spPr>
@@ -2198,7 +2198,7 @@
       <w:tr>
         <w:trPr>
           <w:cantSplit/>
-          <w:trHeight w:val="115" w:hRule="atLeast"/>
+          <w:trHeight w:val="86" w:hRule="exact"/>
         </w:trPr>
         <w:tc>
           <w:tcPr>
@@ -2242,7 +2242,7 @@
       <w:tr>
         <w:trPr>
           <w:cantSplit/>
-          <w:trHeight w:val="748" w:hRule="atLeast"/>
+          <w:trHeight w:val="806" w:hRule="exact"/>
         </w:trPr>
         <w:tc>
           <w:tcPr>
@@ -3142,12 +3142,12 @@
     </w:tbl>
     <w:p>
       <w:pPr>
-        <w:spacing w:before="0" w:after="0" w:line="160" w:lineRule="exact"/>
+        <w:spacing w:before="0" w:after="0" w:line="100" w:lineRule="exact"/>
       </w:pPr>
       <w:r>
         <w:rPr>
           <w:rFonts w:ascii="Trade Gothic Next" w:hAnsi="Trade Gothic Next"/>
-          <w:sz w:val="12"/>
+          <w:sz w:val="6"/>
         </w:rPr>
       </w:r>
     </w:p>
@@ -3166,7 +3166,7 @@
       <w:tr>
         <w:trPr>
           <w:cantSplit/>
-          <w:trHeight w:val="576" w:hRule="atLeast"/>
+          <w:trHeight w:val="547" w:hRule="exact"/>
         </w:trPr>
         <w:tc>
           <w:tcPr>
@@ -3201,7 +3201,7 @@
           <w:tcPr>
             <w:tcW w:type="dxa" w:w="1656"/>
             <w:vMerge w:val="restart"/>
-            <w:vAlign w:val="top"/>
+            <w:vAlign w:val="center"/>
             <w:tcMar>
               <w:top w:w="0" w:type="dxa"/>
               <w:left w:w="0" w:type="dxa"/>
@@ -3217,7 +3217,7 @@
             <w:r>
               <w:drawing>
                 <wp:inline xmlns:a="http://schemas.openxmlformats.org/drawingml/2006/main" xmlns:pic="http://schemas.openxmlformats.org/drawingml/2006/picture">
-                  <wp:extent cx="914400" cy="914400"/>
+                  <wp:extent cx="877824" cy="877824"/>
                   <wp:docPr id="2" name="Picture 2"/>
                   <wp:cNvGraphicFramePr>
                     <a:graphicFrameLocks noChangeAspect="1"/>
@@ -3238,7 +3238,7 @@
                         <pic:spPr>
                           <a:xfrm>
                             <a:off x="0" y="0"/>
-                            <a:ext cx="914400" cy="914400"/>
+                            <a:ext cx="877824" cy="877824"/>
                           </a:xfrm>
                           <a:prstGeom prst="rect"/>
                         </pic:spPr>
@@ -3446,7 +3446,7 @@
       <w:tr>
         <w:trPr>
           <w:cantSplit/>
-          <w:trHeight w:val="115" w:hRule="atLeast"/>
+          <w:trHeight w:val="86" w:hRule="exact"/>
         </w:trPr>
         <w:tc>
           <w:tcPr>
@@ -3490,7 +3490,7 @@
       <w:tr>
         <w:trPr>
           <w:cantSplit/>
-          <w:trHeight w:val="748" w:hRule="atLeast"/>
+          <w:trHeight w:val="806" w:hRule="exact"/>
         </w:trPr>
         <w:tc>
           <w:tcPr>
@@ -4006,12 +4006,12 @@
     </w:tbl>
     <w:p>
       <w:pPr>
-        <w:spacing w:before="0" w:after="0" w:line="160" w:lineRule="exact"/>
+        <w:spacing w:before="0" w:after="0" w:line="100" w:lineRule="exact"/>
       </w:pPr>
       <w:r>
         <w:rPr>
           <w:rFonts w:ascii="Trade Gothic Next" w:hAnsi="Trade Gothic Next"/>
-          <w:sz w:val="12"/>
+          <w:sz w:val="6"/>
         </w:rPr>
       </w:r>
     </w:p>
@@ -4517,18 +4517,6 @@
     </w:tbl>
     <w:p>
       <w:pPr>
-        <w:pageBreakBefore/>
-        <w:spacing w:before="0" w:after="0" w:line="20" w:lineRule="exact"/>
-      </w:pPr>
-      <w:r>
-        <w:rPr>
-          <w:rFonts w:ascii="Trade Gothic Next" w:hAnsi="Trade Gothic Next"/>
-          <w:sz w:val="2"/>
-        </w:rPr>
-      </w:r>
-    </w:p>
-    <w:p>
-      <w:pPr>
         <w:spacing w:before="0" w:after="0" w:line="140" w:lineRule="exact"/>
       </w:pPr>
       <w:r>
@@ -4727,7 +4715,7 @@
               <w:rPr>
                 <w:rFonts w:ascii="Patrick Hand" w:hAnsi="Patrick Hand"/>
                 <w:color w:val="4A2466"/>
-                <w:sz w:val="28"/>
+                <w:sz w:val="24"/>
                 <w:bdr w:val="single" w:sz="8" w:space="1" w:color="9F1D2C"/>
               </w:rPr>
               <w:t xml:space="preserve"> </w:t>
@@ -4736,7 +4724,7 @@
               <w:rPr>
                 <w:rFonts w:ascii="Patrick Hand" w:hAnsi="Patrick Hand"/>
                 <w:color w:val="4A2466"/>
-                <w:sz w:val="28"/>
+                <w:sz w:val="24"/>
                 <w:bdr w:val="single" w:sz="8" w:space="1" w:color="9F1D2C"/>
               </w:rPr>
               <w:t>2</w:t>
@@ -4745,7 +4733,7 @@
               <w:rPr>
                 <w:rFonts w:ascii="ShullHand" w:hAnsi="ShullHand"/>
                 <w:color w:val="4A2466"/>
-                <w:sz w:val="28"/>
+                <w:sz w:val="24"/>
                 <w:bdr w:val="single" w:sz="8" w:space="1" w:color="9F1D2C"/>
               </w:rPr>
               <w:t>+</w:t>
@@ -4754,7 +4742,7 @@
               <w:rPr>
                 <w:rFonts w:ascii="Patrick Hand" w:hAnsi="Patrick Hand"/>
                 <w:color w:val="4A2466"/>
-                <w:sz w:val="28"/>
+                <w:sz w:val="24"/>
                 <w:bdr w:val="single" w:sz="8" w:space="1" w:color="9F1D2C"/>
               </w:rPr>
               <w:t xml:space="preserve"> </w:t>
@@ -4803,7 +4791,7 @@
               <w:rPr>
                 <w:rFonts w:ascii="Patrick Hand" w:hAnsi="Patrick Hand"/>
                 <w:color w:val="16609A"/>
-                <w:sz w:val="20"/>
+                <w:sz w:val="18"/>
               </w:rPr>
               <w:t>2</w:t>
             </w:r>
@@ -4811,7 +4799,7 @@
               <w:rPr>
                 <w:rFonts w:ascii="ShullHand" w:hAnsi="ShullHand"/>
                 <w:color w:val="16609A"/>
-                <w:sz w:val="20"/>
+                <w:sz w:val="18"/>
               </w:rPr>
               <w:t xml:space="preserve"> val. e-, loses </w:t>
             </w:r>
@@ -4819,7 +4807,7 @@
               <w:rPr>
                 <w:rFonts w:ascii="Patrick Hand" w:hAnsi="Patrick Hand"/>
                 <w:color w:val="16609A"/>
-                <w:sz w:val="20"/>
+                <w:sz w:val="18"/>
               </w:rPr>
               <w:t>2</w:t>
             </w:r>
@@ -4908,7 +4896,7 @@
               <w:rPr>
                 <w:rFonts w:ascii="Patrick Hand" w:hAnsi="Patrick Hand"/>
                 <w:color w:val="4A2466"/>
-                <w:sz w:val="28"/>
+                <w:sz w:val="24"/>
                 <w:bdr w:val="single" w:sz="8" w:space="1" w:color="9F1D2C"/>
               </w:rPr>
               <w:t xml:space="preserve"> </w:t>
@@ -4917,7 +4905,7 @@
               <w:rPr>
                 <w:rFonts w:ascii="Patrick Hand" w:hAnsi="Patrick Hand"/>
                 <w:color w:val="4A2466"/>
-                <w:sz w:val="28"/>
+                <w:sz w:val="24"/>
                 <w:bdr w:val="single" w:sz="8" w:space="1" w:color="9F1D2C"/>
               </w:rPr>
               <w:t>3</w:t>
@@ -4926,7 +4914,7 @@
               <w:rPr>
                 <w:rFonts w:ascii="ShullHand" w:hAnsi="ShullHand"/>
                 <w:color w:val="4A2466"/>
-                <w:sz w:val="28"/>
+                <w:sz w:val="24"/>
                 <w:bdr w:val="single" w:sz="8" w:space="1" w:color="9F1D2C"/>
               </w:rPr>
               <w:t>−</w:t>
@@ -4935,7 +4923,7 @@
               <w:rPr>
                 <w:rFonts w:ascii="Patrick Hand" w:hAnsi="Patrick Hand"/>
                 <w:color w:val="4A2466"/>
-                <w:sz w:val="28"/>
+                <w:sz w:val="24"/>
                 <w:bdr w:val="single" w:sz="8" w:space="1" w:color="9F1D2C"/>
               </w:rPr>
               <w:t xml:space="preserve"> </w:t>
@@ -4984,7 +4972,7 @@
               <w:rPr>
                 <w:rFonts w:ascii="Patrick Hand" w:hAnsi="Patrick Hand"/>
                 <w:color w:val="16609A"/>
-                <w:sz w:val="20"/>
+                <w:sz w:val="18"/>
               </w:rPr>
               <w:t>5</w:t>
             </w:r>
@@ -4992,7 +4980,7 @@
               <w:rPr>
                 <w:rFonts w:ascii="ShullHand" w:hAnsi="ShullHand"/>
                 <w:color w:val="16609A"/>
-                <w:sz w:val="20"/>
+                <w:sz w:val="18"/>
               </w:rPr>
               <w:t xml:space="preserve"> val. e-, gains </w:t>
             </w:r>
@@ -5000,7 +4988,7 @@
               <w:rPr>
                 <w:rFonts w:ascii="Patrick Hand" w:hAnsi="Patrick Hand"/>
                 <w:color w:val="16609A"/>
-                <w:sz w:val="20"/>
+                <w:sz w:val="18"/>
               </w:rPr>
               <w:t>3</w:t>
             </w:r>
@@ -5089,7 +5077,7 @@
               <w:rPr>
                 <w:rFonts w:ascii="Patrick Hand" w:hAnsi="Patrick Hand"/>
                 <w:color w:val="4A2466"/>
-                <w:sz w:val="28"/>
+                <w:sz w:val="24"/>
                 <w:bdr w:val="single" w:sz="8" w:space="1" w:color="9F1D2C"/>
               </w:rPr>
               <w:t xml:space="preserve"> </w:t>
@@ -5098,7 +5086,7 @@
               <w:rPr>
                 <w:rFonts w:ascii="Patrick Hand" w:hAnsi="Patrick Hand"/>
                 <w:color w:val="4A2466"/>
-                <w:sz w:val="28"/>
+                <w:sz w:val="24"/>
                 <w:bdr w:val="single" w:sz="8" w:space="1" w:color="9F1D2C"/>
               </w:rPr>
               <w:t>3</w:t>
@@ -5107,7 +5095,7 @@
               <w:rPr>
                 <w:rFonts w:ascii="ShullHand" w:hAnsi="ShullHand"/>
                 <w:color w:val="4A2466"/>
-                <w:sz w:val="28"/>
+                <w:sz w:val="24"/>
                 <w:bdr w:val="single" w:sz="8" w:space="1" w:color="9F1D2C"/>
               </w:rPr>
               <w:t>+</w:t>
@@ -5116,7 +5104,7 @@
               <w:rPr>
                 <w:rFonts w:ascii="Patrick Hand" w:hAnsi="Patrick Hand"/>
                 <w:color w:val="4A2466"/>
-                <w:sz w:val="28"/>
+                <w:sz w:val="24"/>
                 <w:bdr w:val="single" w:sz="8" w:space="1" w:color="9F1D2C"/>
               </w:rPr>
               <w:t xml:space="preserve"> </w:t>
@@ -5165,7 +5153,7 @@
               <w:rPr>
                 <w:rFonts w:ascii="Patrick Hand" w:hAnsi="Patrick Hand"/>
                 <w:color w:val="16609A"/>
-                <w:sz w:val="20"/>
+                <w:sz w:val="18"/>
               </w:rPr>
               <w:t>3</w:t>
             </w:r>
@@ -5173,7 +5161,7 @@
               <w:rPr>
                 <w:rFonts w:ascii="ShullHand" w:hAnsi="ShullHand"/>
                 <w:color w:val="16609A"/>
-                <w:sz w:val="20"/>
+                <w:sz w:val="18"/>
               </w:rPr>
               <w:t xml:space="preserve"> val. e-, loses </w:t>
             </w:r>
@@ -5181,7 +5169,7 @@
               <w:rPr>
                 <w:rFonts w:ascii="Patrick Hand" w:hAnsi="Patrick Hand"/>
                 <w:color w:val="16609A"/>
-                <w:sz w:val="20"/>
+                <w:sz w:val="18"/>
               </w:rPr>
               <w:t>3</w:t>
             </w:r>
@@ -5270,7 +5258,7 @@
               <w:rPr>
                 <w:rFonts w:ascii="Patrick Hand" w:hAnsi="Patrick Hand"/>
                 <w:color w:val="4A2466"/>
-                <w:sz w:val="28"/>
+                <w:sz w:val="24"/>
                 <w:bdr w:val="single" w:sz="8" w:space="1" w:color="9F1D2C"/>
               </w:rPr>
               <w:t xml:space="preserve"> </w:t>
@@ -5279,7 +5267,7 @@
               <w:rPr>
                 <w:rFonts w:ascii="Patrick Hand" w:hAnsi="Patrick Hand"/>
                 <w:color w:val="4A2466"/>
-                <w:sz w:val="28"/>
+                <w:sz w:val="24"/>
                 <w:bdr w:val="single" w:sz="8" w:space="1" w:color="9F1D2C"/>
               </w:rPr>
               <w:t>1</w:t>
@@ -5288,7 +5276,7 @@
               <w:rPr>
                 <w:rFonts w:ascii="ShullHand" w:hAnsi="ShullHand"/>
                 <w:color w:val="4A2466"/>
-                <w:sz w:val="28"/>
+                <w:sz w:val="24"/>
                 <w:bdr w:val="single" w:sz="8" w:space="1" w:color="9F1D2C"/>
               </w:rPr>
               <w:t>−</w:t>
@@ -5297,7 +5285,7 @@
               <w:rPr>
                 <w:rFonts w:ascii="Patrick Hand" w:hAnsi="Patrick Hand"/>
                 <w:color w:val="4A2466"/>
-                <w:sz w:val="28"/>
+                <w:sz w:val="24"/>
                 <w:bdr w:val="single" w:sz="8" w:space="1" w:color="9F1D2C"/>
               </w:rPr>
               <w:t xml:space="preserve"> </w:t>
@@ -5346,7 +5334,7 @@
               <w:rPr>
                 <w:rFonts w:ascii="Patrick Hand" w:hAnsi="Patrick Hand"/>
                 <w:color w:val="16609A"/>
-                <w:sz w:val="20"/>
+                <w:sz w:val="18"/>
               </w:rPr>
               <w:t>7</w:t>
             </w:r>
@@ -5354,7 +5342,7 @@
               <w:rPr>
                 <w:rFonts w:ascii="ShullHand" w:hAnsi="ShullHand"/>
                 <w:color w:val="16609A"/>
-                <w:sz w:val="20"/>
+                <w:sz w:val="18"/>
               </w:rPr>
               <w:t xml:space="preserve"> val. e-, gains </w:t>
             </w:r>
@@ -5362,7 +5350,7 @@
               <w:rPr>
                 <w:rFonts w:ascii="Patrick Hand" w:hAnsi="Patrick Hand"/>
                 <w:color w:val="16609A"/>
-                <w:sz w:val="20"/>
+                <w:sz w:val="18"/>
               </w:rPr>
               <w:t>1</w:t>
             </w:r>

</xml_diff>